<commit_message>
UI/UX batch: stepwise targeting back-nav, double-click bell/brake, playable card highlight, guided hints, invalid-target flash, drag-and-drop deploy, auto-fill attack targets, action history panel, targeting progress indicator, card detail hover panel, dialog styling
</commit_message>
<xml_diff>
--- a/Tards规则书1.0.docx
+++ b/Tards规则书1.0.docx
@@ -2645,7 +2645,7 @@
           </mc:Choice>
           <mc:Fallback>
             <w:pict>
-              <v:rect w14:anchorId="5DCBD307" id="矩形 2" o:spid="_x0000_s1026" style="position:absolute;margin-left:0;margin-top:2.95pt;width:40pt;height:40.5pt;z-index:251665408;visibility:visible;mso-wrap-style:square;mso-wrap-distance-left:9pt;mso-wrap-distance-top:0;mso-wrap-distance-right:9pt;mso-wrap-distance-bottom:0;mso-position-horizontal:center;mso-position-horizontal-relative:margin;mso-position-vertical:absolute;mso-position-vertical-relative:text;v-text-anchor:middle" o:gfxdata="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" fillcolor="#156082 [3204]" strokecolor="#030e13 [484]" strokeweight="1.5pt">
+              <v:rect w14:anchorId="3B3E4D50" id="矩形 2" o:spid="_x0000_s1026" style="position:absolute;margin-left:0;margin-top:2.95pt;width:40pt;height:40.5pt;z-index:251665408;visibility:visible;mso-wrap-style:square;mso-wrap-distance-left:9pt;mso-wrap-distance-top:0;mso-wrap-distance-right:9pt;mso-wrap-distance-bottom:0;mso-position-horizontal:center;mso-position-horizontal-relative:margin;mso-position-vertical:absolute;mso-position-vertical-relative:text;v-text-anchor:middle" o:gfxdata="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" fillcolor="#156082 [3204]" strokecolor="#030e13 [484]" strokeweight="1.5pt">
                 <w10:wrap anchorx="margin"/>
               </v:rect>
             </w:pict>
@@ -2716,7 +2716,7 @@
           </mc:Choice>
           <mc:Fallback>
             <w:pict>
-              <v:rect w14:anchorId="296B3D78" id="矩形 2" o:spid="_x0000_s1026" style="position:absolute;margin-left:146pt;margin-top:2.95pt;width:40pt;height:40.5pt;z-index:251663360;visibility:visible;mso-wrap-style:square;mso-wrap-distance-left:9pt;mso-wrap-distance-top:0;mso-wrap-distance-right:9pt;mso-wrap-distance-bottom:0;mso-position-horizontal:absolute;mso-position-horizontal-relative:text;mso-position-vertical:absolute;mso-position-vertical-relative:text;v-text-anchor:middle" o:gfxdata="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" fillcolor="#156082 [3204]" strokecolor="#030e13 [484]" strokeweight="1.5pt"/>
+              <v:rect w14:anchorId="1587B65D" id="矩形 2" o:spid="_x0000_s1026" style="position:absolute;margin-left:146pt;margin-top:2.95pt;width:40pt;height:40.5pt;z-index:251663360;visibility:visible;mso-wrap-style:square;mso-wrap-distance-left:9pt;mso-wrap-distance-top:0;mso-wrap-distance-right:9pt;mso-wrap-distance-bottom:0;mso-position-horizontal:absolute;mso-position-horizontal-relative:text;mso-position-vertical:absolute;mso-position-vertical-relative:text;v-text-anchor:middle" o:gfxdata="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" fillcolor="#156082 [3204]" strokecolor="#030e13 [484]" strokeweight="1.5pt"/>
             </w:pict>
           </mc:Fallback>
         </mc:AlternateContent>
@@ -2785,7 +2785,7 @@
           </mc:Choice>
           <mc:Fallback>
             <w:pict>
-              <v:rect w14:anchorId="69D69B4F" id="矩形 2" o:spid="_x0000_s1026" style="position:absolute;margin-left:105pt;margin-top:2.95pt;width:40pt;height:40.5pt;z-index:251661312;visibility:visible;mso-wrap-style:square;mso-wrap-distance-left:9pt;mso-wrap-distance-top:0;mso-wrap-distance-right:9pt;mso-wrap-distance-bottom:0;mso-position-horizontal:absolute;mso-position-horizontal-relative:text;mso-position-vertical:absolute;mso-position-vertical-relative:text;v-text-anchor:middle" o:gfxdata="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" fillcolor="#156082 [3204]" strokecolor="#030e13 [484]" strokeweight="1.5pt"/>
+              <v:rect w14:anchorId="4BCB0EDE" id="矩形 2" o:spid="_x0000_s1026" style="position:absolute;margin-left:105pt;margin-top:2.95pt;width:40pt;height:40.5pt;z-index:251661312;visibility:visible;mso-wrap-style:square;mso-wrap-distance-left:9pt;mso-wrap-distance-top:0;mso-wrap-distance-right:9pt;mso-wrap-distance-bottom:0;mso-position-horizontal:absolute;mso-position-horizontal-relative:text;mso-position-vertical:absolute;mso-position-vertical-relative:text;v-text-anchor:middle" o:gfxdata="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" fillcolor="#156082 [3204]" strokecolor="#030e13 [484]" strokeweight="1.5pt"/>
             </w:pict>
           </mc:Fallback>
         </mc:AlternateContent>
@@ -2854,7 +2854,7 @@
           </mc:Choice>
           <mc:Fallback>
             <w:pict>
-              <v:rect w14:anchorId="6BD1DA89" id="矩形 2" o:spid="_x0000_s1026" style="position:absolute;margin-left:63.75pt;margin-top:2.95pt;width:40pt;height:40.5pt;z-index:251659264;visibility:visible;mso-wrap-style:square;mso-wrap-distance-left:9pt;mso-wrap-distance-top:0;mso-wrap-distance-right:9pt;mso-wrap-distance-bottom:0;mso-position-horizontal:absolute;mso-position-horizontal-relative:text;mso-position-vertical:absolute;mso-position-vertical-relative:text;v-text-anchor:middle" o:gfxdata="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" fillcolor="#156082 [3204]" strokecolor="#030e13 [484]" strokeweight="1.5pt"/>
+              <v:rect w14:anchorId="4EF9C697" id="矩形 2" o:spid="_x0000_s1026" style="position:absolute;margin-left:63.75pt;margin-top:2.95pt;width:40pt;height:40.5pt;z-index:251659264;visibility:visible;mso-wrap-style:square;mso-wrap-distance-left:9pt;mso-wrap-distance-top:0;mso-wrap-distance-right:9pt;mso-wrap-distance-bottom:0;mso-position-horizontal:absolute;mso-position-horizontal-relative:text;mso-position-vertical:absolute;mso-position-vertical-relative:text;v-text-anchor:middle" o:gfxdata="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" fillcolor="#156082 [3204]" strokecolor="#030e13 [484]" strokeweight="1.5pt"/>
             </w:pict>
           </mc:Fallback>
         </mc:AlternateContent>
@@ -2974,7 +2974,7 @@
           </mc:Choice>
           <mc:Fallback>
             <w:pict>
-              <v:rect w14:anchorId="0CD6BC11" id="矩形 2" o:spid="_x0000_s1026" style="position:absolute;margin-left:0;margin-top:2.95pt;width:40pt;height:40.5pt;z-index:251670528;visibility:visible;mso-wrap-style:square;mso-wrap-distance-left:9pt;mso-wrap-distance-top:0;mso-wrap-distance-right:9pt;mso-wrap-distance-bottom:0;mso-position-horizontal:center;mso-position-horizontal-relative:margin;mso-position-vertical:absolute;mso-position-vertical-relative:text;v-text-anchor:middle" o:gfxdata="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" fillcolor="#156082 [3204]" strokecolor="#030e13 [484]" strokeweight="1.5pt">
+              <v:rect w14:anchorId="61FB298E" id="矩形 2" o:spid="_x0000_s1026" style="position:absolute;margin-left:0;margin-top:2.95pt;width:40pt;height:40.5pt;z-index:251670528;visibility:visible;mso-wrap-style:square;mso-wrap-distance-left:9pt;mso-wrap-distance-top:0;mso-wrap-distance-right:9pt;mso-wrap-distance-bottom:0;mso-position-horizontal:center;mso-position-horizontal-relative:margin;mso-position-vertical:absolute;mso-position-vertical-relative:text;v-text-anchor:middle" o:gfxdata="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" fillcolor="#156082 [3204]" strokecolor="#030e13 [484]" strokeweight="1.5pt">
                 <w10:wrap anchorx="margin"/>
               </v:rect>
             </w:pict>
@@ -3045,7 +3045,7 @@
           </mc:Choice>
           <mc:Fallback>
             <w:pict>
-              <v:rect w14:anchorId="67091B5C" id="矩形 2" o:spid="_x0000_s1026" style="position:absolute;margin-left:146pt;margin-top:2.95pt;width:40pt;height:40.5pt;z-index:251669504;visibility:visible;mso-wrap-style:square;mso-wrap-distance-left:9pt;mso-wrap-distance-top:0;mso-wrap-distance-right:9pt;mso-wrap-distance-bottom:0;mso-position-horizontal:absolute;mso-position-horizontal-relative:text;mso-position-vertical:absolute;mso-position-vertical-relative:text;v-text-anchor:middle" o:gfxdata="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" fillcolor="#156082 [3204]" strokecolor="#030e13 [484]" strokeweight="1.5pt"/>
+              <v:rect w14:anchorId="6E63A009" id="矩形 2" o:spid="_x0000_s1026" style="position:absolute;margin-left:146pt;margin-top:2.95pt;width:40pt;height:40.5pt;z-index:251669504;visibility:visible;mso-wrap-style:square;mso-wrap-distance-left:9pt;mso-wrap-distance-top:0;mso-wrap-distance-right:9pt;mso-wrap-distance-bottom:0;mso-position-horizontal:absolute;mso-position-horizontal-relative:text;mso-position-vertical:absolute;mso-position-vertical-relative:text;v-text-anchor:middle" o:gfxdata="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" fillcolor="#156082 [3204]" strokecolor="#030e13 [484]" strokeweight="1.5pt"/>
             </w:pict>
           </mc:Fallback>
         </mc:AlternateContent>
@@ -3114,7 +3114,7 @@
           </mc:Choice>
           <mc:Fallback>
             <w:pict>
-              <v:rect w14:anchorId="47D90D00" id="矩形 2" o:spid="_x0000_s1026" style="position:absolute;margin-left:105pt;margin-top:2.95pt;width:40pt;height:40.5pt;z-index:251668480;visibility:visible;mso-wrap-style:square;mso-wrap-distance-left:9pt;mso-wrap-distance-top:0;mso-wrap-distance-right:9pt;mso-wrap-distance-bottom:0;mso-position-horizontal:absolute;mso-position-horizontal-relative:text;mso-position-vertical:absolute;mso-position-vertical-relative:text;v-text-anchor:middle" o:gfxdata="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" fillcolor="#156082 [3204]" strokecolor="#030e13 [484]" strokeweight="1.5pt"/>
+              <v:rect w14:anchorId="058E9C0D" id="矩形 2" o:spid="_x0000_s1026" style="position:absolute;margin-left:105pt;margin-top:2.95pt;width:40pt;height:40.5pt;z-index:251668480;visibility:visible;mso-wrap-style:square;mso-wrap-distance-left:9pt;mso-wrap-distance-top:0;mso-wrap-distance-right:9pt;mso-wrap-distance-bottom:0;mso-position-horizontal:absolute;mso-position-horizontal-relative:text;mso-position-vertical:absolute;mso-position-vertical-relative:text;v-text-anchor:middle" o:gfxdata="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" fillcolor="#156082 [3204]" strokecolor="#030e13 [484]" strokeweight="1.5pt"/>
             </w:pict>
           </mc:Fallback>
         </mc:AlternateContent>
@@ -3183,7 +3183,7 @@
           </mc:Choice>
           <mc:Fallback>
             <w:pict>
-              <v:rect w14:anchorId="5809B74C" id="矩形 2" o:spid="_x0000_s1026" style="position:absolute;margin-left:63.75pt;margin-top:2.95pt;width:40pt;height:40.5pt;z-index:251667456;visibility:visible;mso-wrap-style:square;mso-wrap-distance-left:9pt;mso-wrap-distance-top:0;mso-wrap-distance-right:9pt;mso-wrap-distance-bottom:0;mso-position-horizontal:absolute;mso-position-horizontal-relative:text;mso-position-vertical:absolute;mso-position-vertical-relative:text;v-text-anchor:middle" o:gfxdata="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" fillcolor="#156082 [3204]" strokecolor="#030e13 [484]" strokeweight="1.5pt"/>
+              <v:rect w14:anchorId="6D5562AD" id="矩形 2" o:spid="_x0000_s1026" style="position:absolute;margin-left:63.75pt;margin-top:2.95pt;width:40pt;height:40.5pt;z-index:251667456;visibility:visible;mso-wrap-style:square;mso-wrap-distance-left:9pt;mso-wrap-distance-top:0;mso-wrap-distance-right:9pt;mso-wrap-distance-bottom:0;mso-position-horizontal:absolute;mso-position-horizontal-relative:text;mso-position-vertical:absolute;mso-position-vertical-relative:text;v-text-anchor:middle" o:gfxdata="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" fillcolor="#156082 [3204]" strokecolor="#030e13 [484]" strokeweight="1.5pt"/>
             </w:pict>
           </mc:Fallback>
         </mc:AlternateContent>
@@ -3326,7 +3326,7 @@
           </mc:Choice>
           <mc:Fallback>
             <w:pict>
-              <v:rect w14:anchorId="61303595" id="矩形 2" o:spid="_x0000_s1026" style="position:absolute;margin-left:0;margin-top:2.95pt;width:40pt;height:40.5pt;z-index:251675648;visibility:visible;mso-wrap-style:square;mso-wrap-distance-left:9pt;mso-wrap-distance-top:0;mso-wrap-distance-right:9pt;mso-wrap-distance-bottom:0;mso-position-horizontal:center;mso-position-horizontal-relative:margin;mso-position-vertical:absolute;mso-position-vertical-relative:text;v-text-anchor:middle" o:gfxdata="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" fillcolor="#156082 [3204]" strokecolor="#030e13 [484]" strokeweight="1.5pt">
+              <v:rect w14:anchorId="643F013C" id="矩形 2" o:spid="_x0000_s1026" style="position:absolute;margin-left:0;margin-top:2.95pt;width:40pt;height:40.5pt;z-index:251675648;visibility:visible;mso-wrap-style:square;mso-wrap-distance-left:9pt;mso-wrap-distance-top:0;mso-wrap-distance-right:9pt;mso-wrap-distance-bottom:0;mso-position-horizontal:center;mso-position-horizontal-relative:margin;mso-position-vertical:absolute;mso-position-vertical-relative:text;v-text-anchor:middle" o:gfxdata="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" fillcolor="#156082 [3204]" strokecolor="#030e13 [484]" strokeweight="1.5pt">
                 <w10:wrap anchorx="margin"/>
               </v:rect>
             </w:pict>
@@ -3397,7 +3397,7 @@
           </mc:Choice>
           <mc:Fallback>
             <w:pict>
-              <v:rect w14:anchorId="39E2A0CB" id="矩形 2" o:spid="_x0000_s1026" style="position:absolute;margin-left:146pt;margin-top:2.95pt;width:40pt;height:40.5pt;z-index:251674624;visibility:visible;mso-wrap-style:square;mso-wrap-distance-left:9pt;mso-wrap-distance-top:0;mso-wrap-distance-right:9pt;mso-wrap-distance-bottom:0;mso-position-horizontal:absolute;mso-position-horizontal-relative:text;mso-position-vertical:absolute;mso-position-vertical-relative:text;v-text-anchor:middle" o:gfxdata="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" fillcolor="#156082 [3204]" strokecolor="#030e13 [484]" strokeweight="1.5pt"/>
+              <v:rect w14:anchorId="3D0332DA" id="矩形 2" o:spid="_x0000_s1026" style="position:absolute;margin-left:146pt;margin-top:2.95pt;width:40pt;height:40.5pt;z-index:251674624;visibility:visible;mso-wrap-style:square;mso-wrap-distance-left:9pt;mso-wrap-distance-top:0;mso-wrap-distance-right:9pt;mso-wrap-distance-bottom:0;mso-position-horizontal:absolute;mso-position-horizontal-relative:text;mso-position-vertical:absolute;mso-position-vertical-relative:text;v-text-anchor:middle" o:gfxdata="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" fillcolor="#156082 [3204]" strokecolor="#030e13 [484]" strokeweight="1.5pt"/>
             </w:pict>
           </mc:Fallback>
         </mc:AlternateContent>
@@ -3466,7 +3466,7 @@
           </mc:Choice>
           <mc:Fallback>
             <w:pict>
-              <v:rect w14:anchorId="1173F742" id="矩形 2" o:spid="_x0000_s1026" style="position:absolute;margin-left:105pt;margin-top:2.95pt;width:40pt;height:40.5pt;z-index:251673600;visibility:visible;mso-wrap-style:square;mso-wrap-distance-left:9pt;mso-wrap-distance-top:0;mso-wrap-distance-right:9pt;mso-wrap-distance-bottom:0;mso-position-horizontal:absolute;mso-position-horizontal-relative:text;mso-position-vertical:absolute;mso-position-vertical-relative:text;v-text-anchor:middle" o:gfxdata="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" fillcolor="#156082 [3204]" strokecolor="#030e13 [484]" strokeweight="1.5pt"/>
+              <v:rect w14:anchorId="44F5B52A" id="矩形 2" o:spid="_x0000_s1026" style="position:absolute;margin-left:105pt;margin-top:2.95pt;width:40pt;height:40.5pt;z-index:251673600;visibility:visible;mso-wrap-style:square;mso-wrap-distance-left:9pt;mso-wrap-distance-top:0;mso-wrap-distance-right:9pt;mso-wrap-distance-bottom:0;mso-position-horizontal:absolute;mso-position-horizontal-relative:text;mso-position-vertical:absolute;mso-position-vertical-relative:text;v-text-anchor:middle" o:gfxdata="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" fillcolor="#156082 [3204]" strokecolor="#030e13 [484]" strokeweight="1.5pt"/>
             </w:pict>
           </mc:Fallback>
         </mc:AlternateContent>
@@ -3535,7 +3535,7 @@
           </mc:Choice>
           <mc:Fallback>
             <w:pict>
-              <v:rect w14:anchorId="5075CE9C" id="矩形 2" o:spid="_x0000_s1026" style="position:absolute;margin-left:63.75pt;margin-top:2.95pt;width:40pt;height:40.5pt;z-index:251672576;visibility:visible;mso-wrap-style:square;mso-wrap-distance-left:9pt;mso-wrap-distance-top:0;mso-wrap-distance-right:9pt;mso-wrap-distance-bottom:0;mso-position-horizontal:absolute;mso-position-horizontal-relative:text;mso-position-vertical:absolute;mso-position-vertical-relative:text;v-text-anchor:middle" o:gfxdata="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" fillcolor="#156082 [3204]" strokecolor="#030e13 [484]" strokeweight="1.5pt"/>
+              <v:rect w14:anchorId="212AF18C" id="矩形 2" o:spid="_x0000_s1026" style="position:absolute;margin-left:63.75pt;margin-top:2.95pt;width:40pt;height:40.5pt;z-index:251672576;visibility:visible;mso-wrap-style:square;mso-wrap-distance-left:9pt;mso-wrap-distance-top:0;mso-wrap-distance-right:9pt;mso-wrap-distance-bottom:0;mso-position-horizontal:absolute;mso-position-horizontal-relative:text;mso-position-vertical:absolute;mso-position-vertical-relative:text;v-text-anchor:middle" o:gfxdata="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" fillcolor="#156082 [3204]" strokecolor="#030e13 [484]" strokeweight="1.5pt"/>
             </w:pict>
           </mc:Fallback>
         </mc:AlternateContent>
@@ -3670,7 +3670,7 @@
           </mc:Choice>
           <mc:Fallback>
             <w:pict>
-              <v:rect w14:anchorId="1FDC812B" id="矩形 2" o:spid="_x0000_s1026" style="position:absolute;margin-left:0;margin-top:2.95pt;width:40pt;height:40.5pt;z-index:251680768;visibility:visible;mso-wrap-style:square;mso-wrap-distance-left:9pt;mso-wrap-distance-top:0;mso-wrap-distance-right:9pt;mso-wrap-distance-bottom:0;mso-position-horizontal:center;mso-position-horizontal-relative:margin;mso-position-vertical:absolute;mso-position-vertical-relative:text;v-text-anchor:middle" o:gfxdata="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" fillcolor="#156082 [3204]" strokecolor="#030e13 [484]" strokeweight="1.5pt">
+              <v:rect w14:anchorId="777ECAEF" id="矩形 2" o:spid="_x0000_s1026" style="position:absolute;margin-left:0;margin-top:2.95pt;width:40pt;height:40.5pt;z-index:251680768;visibility:visible;mso-wrap-style:square;mso-wrap-distance-left:9pt;mso-wrap-distance-top:0;mso-wrap-distance-right:9pt;mso-wrap-distance-bottom:0;mso-position-horizontal:center;mso-position-horizontal-relative:margin;mso-position-vertical:absolute;mso-position-vertical-relative:text;v-text-anchor:middle" o:gfxdata="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" fillcolor="#156082 [3204]" strokecolor="#030e13 [484]" strokeweight="1.5pt">
                 <w10:wrap anchorx="margin"/>
               </v:rect>
             </w:pict>
@@ -3741,7 +3741,7 @@
           </mc:Choice>
           <mc:Fallback>
             <w:pict>
-              <v:rect w14:anchorId="5EE273A8" id="矩形 2" o:spid="_x0000_s1026" style="position:absolute;margin-left:146pt;margin-top:2.95pt;width:40pt;height:40.5pt;z-index:251679744;visibility:visible;mso-wrap-style:square;mso-wrap-distance-left:9pt;mso-wrap-distance-top:0;mso-wrap-distance-right:9pt;mso-wrap-distance-bottom:0;mso-position-horizontal:absolute;mso-position-horizontal-relative:text;mso-position-vertical:absolute;mso-position-vertical-relative:text;v-text-anchor:middle" o:gfxdata="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" fillcolor="#156082 [3204]" strokecolor="#030e13 [484]" strokeweight="1.5pt"/>
+              <v:rect w14:anchorId="4BC27C9A" id="矩形 2" o:spid="_x0000_s1026" style="position:absolute;margin-left:146pt;margin-top:2.95pt;width:40pt;height:40.5pt;z-index:251679744;visibility:visible;mso-wrap-style:square;mso-wrap-distance-left:9pt;mso-wrap-distance-top:0;mso-wrap-distance-right:9pt;mso-wrap-distance-bottom:0;mso-position-horizontal:absolute;mso-position-horizontal-relative:text;mso-position-vertical:absolute;mso-position-vertical-relative:text;v-text-anchor:middle" o:gfxdata="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" fillcolor="#156082 [3204]" strokecolor="#030e13 [484]" strokeweight="1.5pt"/>
             </w:pict>
           </mc:Fallback>
         </mc:AlternateContent>
@@ -3810,7 +3810,7 @@
           </mc:Choice>
           <mc:Fallback>
             <w:pict>
-              <v:rect w14:anchorId="2250F8B8" id="矩形 2" o:spid="_x0000_s1026" style="position:absolute;margin-left:105pt;margin-top:2.95pt;width:40pt;height:40.5pt;z-index:251678720;visibility:visible;mso-wrap-style:square;mso-wrap-distance-left:9pt;mso-wrap-distance-top:0;mso-wrap-distance-right:9pt;mso-wrap-distance-bottom:0;mso-position-horizontal:absolute;mso-position-horizontal-relative:text;mso-position-vertical:absolute;mso-position-vertical-relative:text;v-text-anchor:middle" o:gfxdata="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" fillcolor="#156082 [3204]" strokecolor="#030e13 [484]" strokeweight="1.5pt"/>
+              <v:rect w14:anchorId="28023001" id="矩形 2" o:spid="_x0000_s1026" style="position:absolute;margin-left:105pt;margin-top:2.95pt;width:40pt;height:40.5pt;z-index:251678720;visibility:visible;mso-wrap-style:square;mso-wrap-distance-left:9pt;mso-wrap-distance-top:0;mso-wrap-distance-right:9pt;mso-wrap-distance-bottom:0;mso-position-horizontal:absolute;mso-position-horizontal-relative:text;mso-position-vertical:absolute;mso-position-vertical-relative:text;v-text-anchor:middle" o:gfxdata="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" fillcolor="#156082 [3204]" strokecolor="#030e13 [484]" strokeweight="1.5pt"/>
             </w:pict>
           </mc:Fallback>
         </mc:AlternateContent>
@@ -3879,7 +3879,7 @@
           </mc:Choice>
           <mc:Fallback>
             <w:pict>
-              <v:rect w14:anchorId="66319D5C" id="矩形 2" o:spid="_x0000_s1026" style="position:absolute;margin-left:63.75pt;margin-top:2.95pt;width:40pt;height:40.5pt;z-index:251677696;visibility:visible;mso-wrap-style:square;mso-wrap-distance-left:9pt;mso-wrap-distance-top:0;mso-wrap-distance-right:9pt;mso-wrap-distance-bottom:0;mso-position-horizontal:absolute;mso-position-horizontal-relative:text;mso-position-vertical:absolute;mso-position-vertical-relative:text;v-text-anchor:middle" o:gfxdata="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" fillcolor="#156082 [3204]" strokecolor="#030e13 [484]" strokeweight="1.5pt"/>
+              <v:rect w14:anchorId="24ADB943" id="矩形 2" o:spid="_x0000_s1026" style="position:absolute;margin-left:63.75pt;margin-top:2.95pt;width:40pt;height:40.5pt;z-index:251677696;visibility:visible;mso-wrap-style:square;mso-wrap-distance-left:9pt;mso-wrap-distance-top:0;mso-wrap-distance-right:9pt;mso-wrap-distance-bottom:0;mso-position-horizontal:absolute;mso-position-horizontal-relative:text;mso-position-vertical:absolute;mso-position-vertical-relative:text;v-text-anchor:middle" o:gfxdata="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" fillcolor="#156082 [3204]" strokecolor="#030e13 [484]" strokeweight="1.5pt"/>
             </w:pict>
           </mc:Fallback>
         </mc:AlternateContent>
@@ -4014,7 +4014,7 @@
           </mc:Choice>
           <mc:Fallback>
             <w:pict>
-              <v:rect w14:anchorId="089D32BF" id="矩形 2" o:spid="_x0000_s1026" style="position:absolute;margin-left:0;margin-top:2.95pt;width:40pt;height:40.5pt;z-index:251685888;visibility:visible;mso-wrap-style:square;mso-wrap-distance-left:9pt;mso-wrap-distance-top:0;mso-wrap-distance-right:9pt;mso-wrap-distance-bottom:0;mso-position-horizontal:center;mso-position-horizontal-relative:margin;mso-position-vertical:absolute;mso-position-vertical-relative:text;v-text-anchor:middle" o:gfxdata="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" fillcolor="#156082 [3204]" strokecolor="#030e13 [484]" strokeweight="1.5pt">
+              <v:rect w14:anchorId="498FEC16" id="矩形 2" o:spid="_x0000_s1026" style="position:absolute;margin-left:0;margin-top:2.95pt;width:40pt;height:40.5pt;z-index:251685888;visibility:visible;mso-wrap-style:square;mso-wrap-distance-left:9pt;mso-wrap-distance-top:0;mso-wrap-distance-right:9pt;mso-wrap-distance-bottom:0;mso-position-horizontal:center;mso-position-horizontal-relative:margin;mso-position-vertical:absolute;mso-position-vertical-relative:text;v-text-anchor:middle" o:gfxdata="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" fillcolor="#156082 [3204]" strokecolor="#030e13 [484]" strokeweight="1.5pt">
                 <w10:wrap anchorx="margin"/>
               </v:rect>
             </w:pict>
@@ -4085,7 +4085,7 @@
           </mc:Choice>
           <mc:Fallback>
             <w:pict>
-              <v:rect w14:anchorId="30C9D158" id="矩形 2" o:spid="_x0000_s1026" style="position:absolute;margin-left:146pt;margin-top:2.95pt;width:40pt;height:40.5pt;z-index:251684864;visibility:visible;mso-wrap-style:square;mso-wrap-distance-left:9pt;mso-wrap-distance-top:0;mso-wrap-distance-right:9pt;mso-wrap-distance-bottom:0;mso-position-horizontal:absolute;mso-position-horizontal-relative:text;mso-position-vertical:absolute;mso-position-vertical-relative:text;v-text-anchor:middle" o:gfxdata="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" fillcolor="#156082 [3204]" strokecolor="#030e13 [484]" strokeweight="1.5pt"/>
+              <v:rect w14:anchorId="59BB8DDB" id="矩形 2" o:spid="_x0000_s1026" style="position:absolute;margin-left:146pt;margin-top:2.95pt;width:40pt;height:40.5pt;z-index:251684864;visibility:visible;mso-wrap-style:square;mso-wrap-distance-left:9pt;mso-wrap-distance-top:0;mso-wrap-distance-right:9pt;mso-wrap-distance-bottom:0;mso-position-horizontal:absolute;mso-position-horizontal-relative:text;mso-position-vertical:absolute;mso-position-vertical-relative:text;v-text-anchor:middle" o:gfxdata="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" fillcolor="#156082 [3204]" strokecolor="#030e13 [484]" strokeweight="1.5pt"/>
             </w:pict>
           </mc:Fallback>
         </mc:AlternateContent>
@@ -4154,7 +4154,7 @@
           </mc:Choice>
           <mc:Fallback>
             <w:pict>
-              <v:rect w14:anchorId="1AC0E128" id="矩形 2" o:spid="_x0000_s1026" style="position:absolute;margin-left:105pt;margin-top:2.95pt;width:40pt;height:40.5pt;z-index:251683840;visibility:visible;mso-wrap-style:square;mso-wrap-distance-left:9pt;mso-wrap-distance-top:0;mso-wrap-distance-right:9pt;mso-wrap-distance-bottom:0;mso-position-horizontal:absolute;mso-position-horizontal-relative:text;mso-position-vertical:absolute;mso-position-vertical-relative:text;v-text-anchor:middle" o:gfxdata="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" fillcolor="#156082 [3204]" strokecolor="#030e13 [484]" strokeweight="1.5pt"/>
+              <v:rect w14:anchorId="3BA6B382" id="矩形 2" o:spid="_x0000_s1026" style="position:absolute;margin-left:105pt;margin-top:2.95pt;width:40pt;height:40.5pt;z-index:251683840;visibility:visible;mso-wrap-style:square;mso-wrap-distance-left:9pt;mso-wrap-distance-top:0;mso-wrap-distance-right:9pt;mso-wrap-distance-bottom:0;mso-position-horizontal:absolute;mso-position-horizontal-relative:text;mso-position-vertical:absolute;mso-position-vertical-relative:text;v-text-anchor:middle" o:gfxdata="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" fillcolor="#156082 [3204]" strokecolor="#030e13 [484]" strokeweight="1.5pt"/>
             </w:pict>
           </mc:Fallback>
         </mc:AlternateContent>
@@ -4223,7 +4223,7 @@
           </mc:Choice>
           <mc:Fallback>
             <w:pict>
-              <v:rect w14:anchorId="7AB96CBB" id="矩形 2" o:spid="_x0000_s1026" style="position:absolute;margin-left:63.75pt;margin-top:2.95pt;width:40pt;height:40.5pt;z-index:251682816;visibility:visible;mso-wrap-style:square;mso-wrap-distance-left:9pt;mso-wrap-distance-top:0;mso-wrap-distance-right:9pt;mso-wrap-distance-bottom:0;mso-position-horizontal:absolute;mso-position-horizontal-relative:text;mso-position-vertical:absolute;mso-position-vertical-relative:text;v-text-anchor:middle" o:gfxdata="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" fillcolor="#156082 [3204]" strokecolor="#030e13 [484]" strokeweight="1.5pt"/>
+              <v:rect w14:anchorId="0E9F564F" id="矩形 2" o:spid="_x0000_s1026" style="position:absolute;margin-left:63.75pt;margin-top:2.95pt;width:40pt;height:40.5pt;z-index:251682816;visibility:visible;mso-wrap-style:square;mso-wrap-distance-left:9pt;mso-wrap-distance-top:0;mso-wrap-distance-right:9pt;mso-wrap-distance-bottom:0;mso-position-horizontal:absolute;mso-position-horizontal-relative:text;mso-position-vertical:absolute;mso-position-vertical-relative:text;v-text-anchor:middle" o:gfxdata="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" fillcolor="#156082 [3204]" strokecolor="#030e13 [484]" strokeweight="1.5pt"/>
             </w:pict>
           </mc:Fallback>
         </mc:AlternateContent>
@@ -4364,7 +4364,7 @@
           </mc:Choice>
           <mc:Fallback>
             <w:pict>
-              <v:rect w14:anchorId="5B7CEB1B" id="矩形 2" o:spid="_x0000_s1026" style="position:absolute;margin-left:0;margin-top:2.95pt;width:40pt;height:40.5pt;z-index:251691008;visibility:visible;mso-wrap-style:square;mso-wrap-distance-left:9pt;mso-wrap-distance-top:0;mso-wrap-distance-right:9pt;mso-wrap-distance-bottom:0;mso-position-horizontal:center;mso-position-horizontal-relative:margin;mso-position-vertical:absolute;mso-position-vertical-relative:text;v-text-anchor:middle" o:gfxdata="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" fillcolor="#156082 [3204]" strokecolor="#030e13 [484]" strokeweight="1.5pt">
+              <v:rect w14:anchorId="50950BE0" id="矩形 2" o:spid="_x0000_s1026" style="position:absolute;margin-left:0;margin-top:2.95pt;width:40pt;height:40.5pt;z-index:251691008;visibility:visible;mso-wrap-style:square;mso-wrap-distance-left:9pt;mso-wrap-distance-top:0;mso-wrap-distance-right:9pt;mso-wrap-distance-bottom:0;mso-position-horizontal:center;mso-position-horizontal-relative:margin;mso-position-vertical:absolute;mso-position-vertical-relative:text;v-text-anchor:middle" o:gfxdata="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" fillcolor="#156082 [3204]" strokecolor="#030e13 [484]" strokeweight="1.5pt">
                 <w10:wrap anchorx="margin"/>
               </v:rect>
             </w:pict>
@@ -4435,7 +4435,7 @@
           </mc:Choice>
           <mc:Fallback>
             <w:pict>
-              <v:rect w14:anchorId="422E6173" id="矩形 2" o:spid="_x0000_s1026" style="position:absolute;margin-left:146pt;margin-top:2.95pt;width:40pt;height:40.5pt;z-index:251689984;visibility:visible;mso-wrap-style:square;mso-wrap-distance-left:9pt;mso-wrap-distance-top:0;mso-wrap-distance-right:9pt;mso-wrap-distance-bottom:0;mso-position-horizontal:absolute;mso-position-horizontal-relative:text;mso-position-vertical:absolute;mso-position-vertical-relative:text;v-text-anchor:middle" o:gfxdata="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" fillcolor="#156082 [3204]" strokecolor="#030e13 [484]" strokeweight="1.5pt"/>
+              <v:rect w14:anchorId="75070BD3" id="矩形 2" o:spid="_x0000_s1026" style="position:absolute;margin-left:146pt;margin-top:2.95pt;width:40pt;height:40.5pt;z-index:251689984;visibility:visible;mso-wrap-style:square;mso-wrap-distance-left:9pt;mso-wrap-distance-top:0;mso-wrap-distance-right:9pt;mso-wrap-distance-bottom:0;mso-position-horizontal:absolute;mso-position-horizontal-relative:text;mso-position-vertical:absolute;mso-position-vertical-relative:text;v-text-anchor:middle" o:gfxdata="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" fillcolor="#156082 [3204]" strokecolor="#030e13 [484]" strokeweight="1.5pt"/>
             </w:pict>
           </mc:Fallback>
         </mc:AlternateContent>
@@ -4504,7 +4504,7 @@
           </mc:Choice>
           <mc:Fallback>
             <w:pict>
-              <v:rect w14:anchorId="436367D3" id="矩形 2" o:spid="_x0000_s1026" style="position:absolute;margin-left:105pt;margin-top:2.95pt;width:40pt;height:40.5pt;z-index:251688960;visibility:visible;mso-wrap-style:square;mso-wrap-distance-left:9pt;mso-wrap-distance-top:0;mso-wrap-distance-right:9pt;mso-wrap-distance-bottom:0;mso-position-horizontal:absolute;mso-position-horizontal-relative:text;mso-position-vertical:absolute;mso-position-vertical-relative:text;v-text-anchor:middle" o:gfxdata="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" fillcolor="#156082 [3204]" strokecolor="#030e13 [484]" strokeweight="1.5pt"/>
+              <v:rect w14:anchorId="6EC3C5E1" id="矩形 2" o:spid="_x0000_s1026" style="position:absolute;margin-left:105pt;margin-top:2.95pt;width:40pt;height:40.5pt;z-index:251688960;visibility:visible;mso-wrap-style:square;mso-wrap-distance-left:9pt;mso-wrap-distance-top:0;mso-wrap-distance-right:9pt;mso-wrap-distance-bottom:0;mso-position-horizontal:absolute;mso-position-horizontal-relative:text;mso-position-vertical:absolute;mso-position-vertical-relative:text;v-text-anchor:middle" o:gfxdata="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" fillcolor="#156082 [3204]" strokecolor="#030e13 [484]" strokeweight="1.5pt"/>
             </w:pict>
           </mc:Fallback>
         </mc:AlternateContent>
@@ -4573,7 +4573,7 @@
           </mc:Choice>
           <mc:Fallback>
             <w:pict>
-              <v:rect w14:anchorId="0D020213" id="矩形 2" o:spid="_x0000_s1026" style="position:absolute;margin-left:63.75pt;margin-top:2.95pt;width:40pt;height:40.5pt;z-index:251687936;visibility:visible;mso-wrap-style:square;mso-wrap-distance-left:9pt;mso-wrap-distance-top:0;mso-wrap-distance-right:9pt;mso-wrap-distance-bottom:0;mso-position-horizontal:absolute;mso-position-horizontal-relative:text;mso-position-vertical:absolute;mso-position-vertical-relative:text;v-text-anchor:middle" o:gfxdata="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" fillcolor="#156082 [3204]" strokecolor="#030e13 [484]" strokeweight="1.5pt"/>
+              <v:rect w14:anchorId="631984E3" id="矩形 2" o:spid="_x0000_s1026" style="position:absolute;margin-left:63.75pt;margin-top:2.95pt;width:40pt;height:40.5pt;z-index:251687936;visibility:visible;mso-wrap-style:square;mso-wrap-distance-left:9pt;mso-wrap-distance-top:0;mso-wrap-distance-right:9pt;mso-wrap-distance-bottom:0;mso-position-horizontal:absolute;mso-position-horizontal-relative:text;mso-position-vertical:absolute;mso-position-vertical-relative:text;v-text-anchor:middle" o:gfxdata="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" fillcolor="#156082 [3204]" strokecolor="#030e13 [484]" strokeweight="1.5pt"/>
             </w:pict>
           </mc:Fallback>
         </mc:AlternateContent>

</xml_diff>